<commit_message>
Simplify Assumptions Risks Dependencies doc — plain black and white table
Removed all colours, emojis and decorative styling.
Clean black border table with alternating white/grey rows.

Co-Authored-By: Claude Sonnet 4.6 <noreply@anthropic.com>
</commit_message>
<xml_diff>
--- a/archive/documents/SHARP_EV_Assumptions_Risks_Dependencies.docx
+++ b/archive/documents/SHARP_EV_Assumptions_Risks_Dependencies.docx
@@ -8,9 +8,6 @@
         <w:jc w:val="center"/>
       </w:pPr>
       <w:r>
-        <w:rPr>
-          <w:color w:val="1F497D"/>
-        </w:rPr>
         <w:t>SHARP EV AI Chatbot</w:t>
       </w:r>
     </w:p>
@@ -20,9 +17,6 @@
         <w:jc w:val="center"/>
       </w:pPr>
       <w:r>
-        <w:rPr>
-          <w:color w:val="2E74B5"/>
-        </w:rPr>
         <w:t>Top 5 Assumptions, Risks &amp; Dependencies</w:t>
       </w:r>
     </w:p>
@@ -33,56 +27,27 @@
       <w:r>
         <w:rPr>
           <w:i/>
-          <w:color w:val="707070"/>
-          <w:sz w:val="17"/>
+          <w:sz w:val="18"/>
         </w:rPr>
         <w:t>Prepared for: SHARP Business &amp; Client Team   |   Date: 2026-06-23   |   Version: 1.0</w:t>
       </w:r>
     </w:p>
     <w:p/>
-    <w:tbl>
-      <w:tblPr>
-        <w:tblStyle w:val="TableGrid"/>
-        <w:tblW w:type="auto" w:w="0"/>
-        <w:tblLook w:firstColumn="1" w:firstRow="1" w:lastColumn="0" w:lastRow="0" w:noHBand="0" w:noVBand="1" w:val="04A0"/>
-      </w:tblPr>
-      <w:tblGrid>
-        <w:gridCol w:w="9972"/>
-      </w:tblGrid>
-      <w:tr>
-        <w:tc>
-          <w:tcPr>
-            <w:tcW w:type="dxa" w:w="9972"/>
-            <w:shd w:val="clear" w:color="auto" w:fill="EBF3FB"/>
-            <w:tcBorders>
-              <w:top w:val="single" w:sz="4" w:space="0" w:color="2E74B5"/>
-              <w:left w:val="single" w:sz="4" w:space="0" w:color="2E74B5"/>
-              <w:bottom w:val="single" w:sz="4" w:space="0" w:color="2E74B5"/>
-              <w:right w:val="single" w:sz="4" w:space="0" w:color="2E74B5"/>
-            </w:tcBorders>
-          </w:tcPr>
-          <w:p>
-            <w:pPr>
-              <w:spacing w:before="80" w:after="80"/>
-            </w:pPr>
-            <w:r>
-              <w:rPr>
-                <w:b/>
-                <w:color w:val="1F497D"/>
-                <w:sz w:val="18"/>
-              </w:rPr>
-              <w:t xml:space="preserve">Purpose: </w:t>
-            </w:r>
-            <w:r>
-              <w:rPr>
-                <w:sz w:val="18"/>
-              </w:rPr>
-              <w:t>This document outlines the top 5 assumptions, risks, and dependencies that must be confirmed and managed to ensure successful delivery of the SHARP EV AI Chatbot project. Each item requires SHARP's acknowledgement and action before development begins.</w:t>
-            </w:r>
-          </w:p>
-        </w:tc>
-      </w:tr>
-    </w:tbl>
+    <w:p>
+      <w:r>
+        <w:rPr>
+          <w:b/>
+          <w:sz w:val="19"/>
+        </w:rPr>
+        <w:t xml:space="preserve">Purpose: </w:t>
+      </w:r>
+      <w:r>
+        <w:rPr>
+          <w:sz w:val="19"/>
+        </w:rPr>
+        <w:t>This document outlines the top 5 assumptions, risks, and dependencies that must be confirmed and managed to ensure successful delivery of the SHARP EV AI Chatbot project. Each item requires acknowledgement and action from SHARP before development begins.</w:t>
+      </w:r>
+    </w:p>
     <w:p/>
     <w:tbl>
       <w:tblPr>
@@ -101,26 +66,26 @@
       <w:tr>
         <w:tc>
           <w:tcPr>
-            <w:tcW w:type="dxa" w:w="454"/>
-            <w:shd w:val="clear" w:color="auto" w:fill="1F497D"/>
+            <w:tcW w:type="dxa" w:w="397"/>
+            <w:shd w:val="clear" w:color="auto" w:fill="D9D9D9"/>
             <w:tcBorders>
-              <w:top w:val="single" w:sz="6" w:space="0" w:color="1F497D"/>
-              <w:left w:val="single" w:sz="6" w:space="0" w:color="1F497D"/>
-              <w:bottom w:val="single" w:sz="6" w:space="0" w:color="1F497D"/>
-              <w:right w:val="single" w:sz="6" w:space="0" w:color="1F497D"/>
+              <w:top w:val="single" w:sz="6" w:space="0" w:color="000000"/>
+              <w:left w:val="single" w:sz="6" w:space="0" w:color="000000"/>
+              <w:bottom w:val="single" w:sz="6" w:space="0" w:color="000000"/>
+              <w:right w:val="single" w:sz="6" w:space="0" w:color="000000"/>
             </w:tcBorders>
             <w:vAlign w:val="center"/>
           </w:tcPr>
           <w:p>
             <w:pPr>
-              <w:spacing w:before="60" w:after="60"/>
+              <w:spacing w:before="80" w:after="80"/>
               <w:jc w:val="center"/>
             </w:pPr>
             <w:r>
               <w:rPr>
                 <w:b/>
                 <w:i w:val="0"/>
-                <w:color w:val="FFFFFF"/>
+                <w:color w:val="000000"/>
                 <w:sz w:val="20"/>
               </w:rPr>
               <w:t>#</w:t>
@@ -129,26 +94,26 @@
         </w:tc>
         <w:tc>
           <w:tcPr>
-            <w:tcW w:type="dxa" w:w="1587"/>
-            <w:shd w:val="clear" w:color="auto" w:fill="1F497D"/>
+            <w:tcW w:type="dxa" w:w="1814"/>
+            <w:shd w:val="clear" w:color="auto" w:fill="D9D9D9"/>
             <w:tcBorders>
-              <w:top w:val="single" w:sz="6" w:space="0" w:color="1F497D"/>
-              <w:left w:val="single" w:sz="6" w:space="0" w:color="1F497D"/>
-              <w:bottom w:val="single" w:sz="6" w:space="0" w:color="1F497D"/>
-              <w:right w:val="single" w:sz="6" w:space="0" w:color="1F497D"/>
+              <w:top w:val="single" w:sz="6" w:space="0" w:color="000000"/>
+              <w:left w:val="single" w:sz="6" w:space="0" w:color="000000"/>
+              <w:bottom w:val="single" w:sz="6" w:space="0" w:color="000000"/>
+              <w:right w:val="single" w:sz="6" w:space="0" w:color="000000"/>
             </w:tcBorders>
             <w:vAlign w:val="center"/>
           </w:tcPr>
           <w:p>
             <w:pPr>
-              <w:spacing w:before="60" w:after="60"/>
+              <w:spacing w:before="80" w:after="80"/>
               <w:jc w:val="center"/>
             </w:pPr>
             <w:r>
               <w:rPr>
                 <w:b/>
                 <w:i w:val="0"/>
-                <w:color w:val="FFFFFF"/>
+                <w:color w:val="000000"/>
                 <w:sz w:val="20"/>
               </w:rPr>
               <w:t>Topic</w:t>
@@ -157,26 +122,26 @@
         </w:tc>
         <w:tc>
           <w:tcPr>
-            <w:tcW w:type="dxa" w:w="2381"/>
-            <w:shd w:val="clear" w:color="auto" w:fill="1F497D"/>
+            <w:tcW w:type="dxa" w:w="2268"/>
+            <w:shd w:val="clear" w:color="auto" w:fill="D9D9D9"/>
             <w:tcBorders>
-              <w:top w:val="single" w:sz="6" w:space="0" w:color="1F497D"/>
-              <w:left w:val="single" w:sz="6" w:space="0" w:color="1F497D"/>
-              <w:bottom w:val="single" w:sz="6" w:space="0" w:color="1F497D"/>
-              <w:right w:val="single" w:sz="6" w:space="0" w:color="1F497D"/>
+              <w:top w:val="single" w:sz="6" w:space="0" w:color="000000"/>
+              <w:left w:val="single" w:sz="6" w:space="0" w:color="000000"/>
+              <w:bottom w:val="single" w:sz="6" w:space="0" w:color="000000"/>
+              <w:right w:val="single" w:sz="6" w:space="0" w:color="000000"/>
             </w:tcBorders>
             <w:vAlign w:val="center"/>
           </w:tcPr>
           <w:p>
             <w:pPr>
-              <w:spacing w:before="60" w:after="60"/>
+              <w:spacing w:before="80" w:after="80"/>
               <w:jc w:val="center"/>
             </w:pPr>
             <w:r>
               <w:rPr>
                 <w:b/>
                 <w:i w:val="0"/>
-                <w:color w:val="FFFFFF"/>
+                <w:color w:val="000000"/>
                 <w:sz w:val="20"/>
               </w:rPr>
               <w:t>Assumption</w:t>
@@ -186,25 +151,25 @@
         <w:tc>
           <w:tcPr>
             <w:tcW w:type="dxa" w:w="2381"/>
-            <w:shd w:val="clear" w:color="auto" w:fill="1F497D"/>
+            <w:shd w:val="clear" w:color="auto" w:fill="D9D9D9"/>
             <w:tcBorders>
-              <w:top w:val="single" w:sz="6" w:space="0" w:color="1F497D"/>
-              <w:left w:val="single" w:sz="6" w:space="0" w:color="1F497D"/>
-              <w:bottom w:val="single" w:sz="6" w:space="0" w:color="1F497D"/>
-              <w:right w:val="single" w:sz="6" w:space="0" w:color="1F497D"/>
+              <w:top w:val="single" w:sz="6" w:space="0" w:color="000000"/>
+              <w:left w:val="single" w:sz="6" w:space="0" w:color="000000"/>
+              <w:bottom w:val="single" w:sz="6" w:space="0" w:color="000000"/>
+              <w:right w:val="single" w:sz="6" w:space="0" w:color="000000"/>
             </w:tcBorders>
             <w:vAlign w:val="center"/>
           </w:tcPr>
           <w:p>
             <w:pPr>
-              <w:spacing w:before="60" w:after="60"/>
+              <w:spacing w:before="80" w:after="80"/>
               <w:jc w:val="center"/>
             </w:pPr>
             <w:r>
               <w:rPr>
                 <w:b/>
                 <w:i w:val="0"/>
-                <w:color w:val="FFFFFF"/>
+                <w:color w:val="000000"/>
                 <w:sz w:val="20"/>
               </w:rPr>
               <w:t>Risk if Not Met</w:t>
@@ -213,26 +178,26 @@
         </w:tc>
         <w:tc>
           <w:tcPr>
-            <w:tcW w:type="dxa" w:w="2381"/>
-            <w:shd w:val="clear" w:color="auto" w:fill="1F497D"/>
+            <w:tcW w:type="dxa" w:w="2324"/>
+            <w:shd w:val="clear" w:color="auto" w:fill="D9D9D9"/>
             <w:tcBorders>
-              <w:top w:val="single" w:sz="6" w:space="0" w:color="1F497D"/>
-              <w:left w:val="single" w:sz="6" w:space="0" w:color="1F497D"/>
-              <w:bottom w:val="single" w:sz="6" w:space="0" w:color="1F497D"/>
-              <w:right w:val="single" w:sz="6" w:space="0" w:color="1F497D"/>
+              <w:top w:val="single" w:sz="6" w:space="0" w:color="000000"/>
+              <w:left w:val="single" w:sz="6" w:space="0" w:color="000000"/>
+              <w:bottom w:val="single" w:sz="6" w:space="0" w:color="000000"/>
+              <w:right w:val="single" w:sz="6" w:space="0" w:color="000000"/>
             </w:tcBorders>
             <w:vAlign w:val="center"/>
           </w:tcPr>
           <w:p>
             <w:pPr>
-              <w:spacing w:before="60" w:after="60"/>
+              <w:spacing w:before="80" w:after="80"/>
               <w:jc w:val="center"/>
             </w:pPr>
             <w:r>
               <w:rPr>
                 <w:b/>
                 <w:i w:val="0"/>
-                <w:color w:val="FFFFFF"/>
+                <w:color w:val="000000"/>
                 <w:sz w:val="20"/>
               </w:rPr>
               <w:t>Mitigation</w:t>
@@ -241,30 +206,29 @@
         </w:tc>
       </w:tr>
       <w:tr>
-        <w:trPr/>
         <w:tc>
           <w:tcPr>
-            <w:tcW w:type="dxa" w:w="454"/>
+            <w:tcW w:type="dxa" w:w="397"/>
             <w:vAlign w:val="center"/>
-            <w:shd w:val="clear" w:color="auto" w:fill="1565C0"/>
+            <w:shd w:val="clear" w:color="auto" w:fill="FFFFFF"/>
             <w:tcBorders>
-              <w:top w:val="single" w:sz="6" w:space="0" w:color="1565C0"/>
-              <w:left w:val="single" w:sz="6" w:space="0" w:color="1565C0"/>
-              <w:bottom w:val="single" w:sz="6" w:space="0" w:color="1565C0"/>
-              <w:right w:val="single" w:sz="6" w:space="0" w:color="1565C0"/>
+              <w:top w:val="single" w:sz="4" w:space="0" w:color="000000"/>
+              <w:left w:val="single" w:sz="4" w:space="0" w:color="000000"/>
+              <w:bottom w:val="single" w:sz="4" w:space="0" w:color="000000"/>
+              <w:right w:val="single" w:sz="4" w:space="0" w:color="000000"/>
             </w:tcBorders>
           </w:tcPr>
           <w:p>
             <w:pPr>
-              <w:spacing w:before="60" w:after="60"/>
+              <w:spacing w:before="80" w:after="80"/>
               <w:jc w:val="center"/>
             </w:pPr>
             <w:r>
               <w:rPr>
                 <w:b/>
                 <w:i w:val="0"/>
-                <w:color w:val="FFFFFF"/>
-                <w:sz w:val="28"/>
+                <w:color w:val="000000"/>
+                <w:sz w:val="22"/>
               </w:rPr>
               <w:t>1</w:t>
             </w:r>
@@ -272,57 +236,55 @@
         </w:tc>
         <w:tc>
           <w:tcPr>
-            <w:tcW w:type="dxa" w:w="1587"/>
+            <w:tcW w:type="dxa" w:w="1814"/>
             <w:vAlign w:val="center"/>
-            <w:shd w:val="clear" w:color="auto" w:fill="1565C0"/>
+            <w:shd w:val="clear" w:color="auto" w:fill="FFFFFF"/>
             <w:tcBorders>
-              <w:top w:val="single" w:sz="4" w:space="0" w:color="1565C0"/>
-              <w:left w:val="single" w:sz="4" w:space="0" w:color="1565C0"/>
-              <w:bottom w:val="single" w:sz="4" w:space="0" w:color="1565C0"/>
-              <w:right w:val="single" w:sz="4" w:space="0" w:color="1565C0"/>
+              <w:top w:val="single" w:sz="4" w:space="0" w:color="000000"/>
+              <w:left w:val="single" w:sz="4" w:space="0" w:color="000000"/>
+              <w:bottom w:val="single" w:sz="4" w:space="0" w:color="000000"/>
+              <w:right w:val="single" w:sz="4" w:space="0" w:color="000000"/>
             </w:tcBorders>
           </w:tcPr>
           <w:p>
             <w:pPr>
-              <w:spacing w:before="60" w:after="60"/>
-              <w:jc w:val="center"/>
+              <w:spacing w:before="80" w:after="80"/>
+              <w:jc w:val="left"/>
             </w:pPr>
             <w:r>
               <w:rPr>
                 <w:b/>
                 <w:i w:val="0"/>
-                <w:color w:val="FFFFFF"/>
+                <w:color w:val="000000"/>
                 <w:sz w:val="19"/>
               </w:rPr>
-              <w:t>📄  EV Manual</w:t>
-              <w:br/>
-              <w:t>Quality</w:t>
+              <w:t>EV Manual Quality</w:t>
             </w:r>
           </w:p>
         </w:tc>
         <w:tc>
           <w:tcPr>
-            <w:tcW w:type="dxa" w:w="2381"/>
+            <w:tcW w:type="dxa" w:w="2268"/>
             <w:vAlign w:val="center"/>
-            <w:shd w:val="clear" w:color="auto" w:fill="E3F2FD"/>
+            <w:shd w:val="clear" w:color="auto" w:fill="FFFFFF"/>
             <w:tcBorders>
-              <w:top w:val="single" w:sz="2" w:space="0" w:color="DDDDDD"/>
-              <w:left w:val="single" w:sz="2" w:space="0" w:color="DDDDDD"/>
-              <w:bottom w:val="single" w:sz="2" w:space="0" w:color="DDDDDD"/>
-              <w:right w:val="single" w:sz="2" w:space="0" w:color="DDDDDD"/>
+              <w:top w:val="single" w:sz="4" w:space="0" w:color="000000"/>
+              <w:left w:val="single" w:sz="4" w:space="0" w:color="000000"/>
+              <w:bottom w:val="single" w:sz="4" w:space="0" w:color="000000"/>
+              <w:right w:val="single" w:sz="4" w:space="0" w:color="000000"/>
             </w:tcBorders>
           </w:tcPr>
           <w:p>
             <w:pPr>
-              <w:spacing w:before="60" w:after="60"/>
+              <w:spacing w:before="80" w:after="80"/>
               <w:jc w:val="left"/>
             </w:pPr>
             <w:r>
               <w:rPr>
                 <w:b w:val="0"/>
                 <w:i w:val="0"/>
-                <w:color w:val="1A1A1A"/>
-                <w:sz w:val="18"/>
+                <w:color w:val="000000"/>
+                <w:sz w:val="19"/>
               </w:rPr>
               <w:t>SHARP provides EV manuals in clean, readable digital format.</w:t>
             </w:r>
@@ -332,31 +294,25 @@
           <w:tcPr>
             <w:tcW w:type="dxa" w:w="2381"/>
             <w:vAlign w:val="center"/>
-            <w:shd w:val="clear" w:color="auto" w:fill="FFF8F8"/>
+            <w:shd w:val="clear" w:color="auto" w:fill="FFFFFF"/>
             <w:tcBorders>
-              <w:top w:val="single" w:sz="2" w:space="0" w:color="DDDDDD"/>
-              <w:left w:val="single" w:sz="2" w:space="0" w:color="DDDDDD"/>
-              <w:bottom w:val="single" w:sz="2" w:space="0" w:color="DDDDDD"/>
-              <w:right w:val="single" w:sz="2" w:space="0" w:color="DDDDDD"/>
+              <w:top w:val="single" w:sz="4" w:space="0" w:color="000000"/>
+              <w:left w:val="single" w:sz="4" w:space="0" w:color="000000"/>
+              <w:bottom w:val="single" w:sz="4" w:space="0" w:color="000000"/>
+              <w:right w:val="single" w:sz="4" w:space="0" w:color="000000"/>
             </w:tcBorders>
           </w:tcPr>
           <w:p>
             <w:pPr>
-              <w:spacing w:before="60" w:after="60"/>
+              <w:spacing w:before="80" w:after="80"/>
               <w:jc w:val="left"/>
             </w:pPr>
             <w:r>
               <w:rPr>
-                <w:b/>
-                <w:color w:val="C62828"/>
-                <w:sz w:val="18"/>
-              </w:rPr>
-              <w:t xml:space="preserve">⚠  </w:t>
-            </w:r>
-            <w:r>
-              <w:rPr>
-                <w:color w:val="1A1A1A"/>
-                <w:sz w:val="18"/>
+                <w:b w:val="0"/>
+                <w:i w:val="0"/>
+                <w:color w:val="000000"/>
+                <w:sz w:val="19"/>
               </w:rPr>
               <w:t>Poor quality documents cause the AI to give wrong or incomplete answers to customers.</w:t>
             </w:r>
@@ -364,64 +320,57 @@
         </w:tc>
         <w:tc>
           <w:tcPr>
-            <w:tcW w:type="dxa" w:w="2381"/>
+            <w:tcW w:type="dxa" w:w="2324"/>
             <w:vAlign w:val="center"/>
-            <w:shd w:val="clear" w:color="auto" w:fill="F6FFF6"/>
+            <w:shd w:val="clear" w:color="auto" w:fill="FFFFFF"/>
             <w:tcBorders>
-              <w:top w:val="single" w:sz="2" w:space="0" w:color="DDDDDD"/>
-              <w:left w:val="single" w:sz="2" w:space="0" w:color="DDDDDD"/>
-              <w:bottom w:val="single" w:sz="2" w:space="0" w:color="DDDDDD"/>
-              <w:right w:val="single" w:sz="2" w:space="0" w:color="DDDDDD"/>
+              <w:top w:val="single" w:sz="4" w:space="0" w:color="000000"/>
+              <w:left w:val="single" w:sz="4" w:space="0" w:color="000000"/>
+              <w:bottom w:val="single" w:sz="4" w:space="0" w:color="000000"/>
+              <w:right w:val="single" w:sz="4" w:space="0" w:color="000000"/>
             </w:tcBorders>
           </w:tcPr>
           <w:p>
             <w:pPr>
-              <w:spacing w:before="60" w:after="60"/>
+              <w:spacing w:before="80" w:after="80"/>
               <w:jc w:val="left"/>
             </w:pPr>
             <w:r>
               <w:rPr>
-                <w:b/>
-                <w:color w:val="2E7D32"/>
-                <w:sz w:val="18"/>
+                <w:b w:val="0"/>
+                <w:i w:val="0"/>
+                <w:color w:val="000000"/>
+                <w:sz w:val="19"/>
               </w:rPr>
-              <w:t xml:space="preserve">✔  </w:t>
-            </w:r>
-            <w:r>
-              <w:rPr>
-                <w:color w:val="1A1A1A"/>
-                <w:sz w:val="18"/>
-              </w:rPr>
-              <w:t>Confirm document format before project starts. If scanned images, treat as a blocker before any AI development begins.</w:t>
+              <w:t>Confirm document format before project starts. If scanned images only, treat as a blocker before AI development begins.</w:t>
             </w:r>
           </w:p>
         </w:tc>
       </w:tr>
       <w:tr>
-        <w:trPr/>
         <w:tc>
           <w:tcPr>
-            <w:tcW w:type="dxa" w:w="454"/>
+            <w:tcW w:type="dxa" w:w="397"/>
             <w:vAlign w:val="center"/>
-            <w:shd w:val="clear" w:color="auto" w:fill="C62828"/>
+            <w:shd w:val="clear" w:color="auto" w:fill="F2F2F2"/>
             <w:tcBorders>
-              <w:top w:val="single" w:sz="6" w:space="0" w:color="C62828"/>
-              <w:left w:val="single" w:sz="6" w:space="0" w:color="C62828"/>
-              <w:bottom w:val="single" w:sz="6" w:space="0" w:color="C62828"/>
-              <w:right w:val="single" w:sz="6" w:space="0" w:color="C62828"/>
+              <w:top w:val="single" w:sz="4" w:space="0" w:color="000000"/>
+              <w:left w:val="single" w:sz="4" w:space="0" w:color="000000"/>
+              <w:bottom w:val="single" w:sz="4" w:space="0" w:color="000000"/>
+              <w:right w:val="single" w:sz="4" w:space="0" w:color="000000"/>
             </w:tcBorders>
           </w:tcPr>
           <w:p>
             <w:pPr>
-              <w:spacing w:before="60" w:after="60"/>
+              <w:spacing w:before="80" w:after="80"/>
               <w:jc w:val="center"/>
             </w:pPr>
             <w:r>
               <w:rPr>
                 <w:b/>
                 <w:i w:val="0"/>
-                <w:color w:val="FFFFFF"/>
-                <w:sz w:val="28"/>
+                <w:color w:val="000000"/>
+                <w:sz w:val="22"/>
               </w:rPr>
               <w:t>2</w:t>
             </w:r>
@@ -429,31 +378,57 @@
         </w:tc>
         <w:tc>
           <w:tcPr>
-            <w:tcW w:type="dxa" w:w="1587"/>
+            <w:tcW w:type="dxa" w:w="1814"/>
             <w:vAlign w:val="center"/>
-            <w:shd w:val="clear" w:color="auto" w:fill="C62828"/>
+            <w:shd w:val="clear" w:color="auto" w:fill="F2F2F2"/>
             <w:tcBorders>
-              <w:top w:val="single" w:sz="4" w:space="0" w:color="C62828"/>
-              <w:left w:val="single" w:sz="4" w:space="0" w:color="C62828"/>
-              <w:bottom w:val="single" w:sz="4" w:space="0" w:color="C62828"/>
-              <w:right w:val="single" w:sz="4" w:space="0" w:color="C62828"/>
+              <w:top w:val="single" w:sz="4" w:space="0" w:color="000000"/>
+              <w:left w:val="single" w:sz="4" w:space="0" w:color="000000"/>
+              <w:bottom w:val="single" w:sz="4" w:space="0" w:color="000000"/>
+              <w:right w:val="single" w:sz="4" w:space="0" w:color="000000"/>
             </w:tcBorders>
           </w:tcPr>
           <w:p>
             <w:pPr>
-              <w:spacing w:before="60" w:after="60"/>
-              <w:jc w:val="center"/>
+              <w:spacing w:before="80" w:after="80"/>
+              <w:jc w:val="left"/>
             </w:pPr>
             <w:r>
               <w:rPr>
                 <w:b/>
                 <w:i w:val="0"/>
-                <w:color w:val="FFFFFF"/>
+                <w:color w:val="000000"/>
                 <w:sz w:val="19"/>
               </w:rPr>
-              <w:t>🚗  Vehicle Sensor</w:t>
-              <w:br/>
-              <w:t>Data Connection</w:t>
+              <w:t>Vehicle Sensor Data Connection</w:t>
+            </w:r>
+          </w:p>
+        </w:tc>
+        <w:tc>
+          <w:tcPr>
+            <w:tcW w:type="dxa" w:w="2268"/>
+            <w:vAlign w:val="center"/>
+            <w:shd w:val="clear" w:color="auto" w:fill="F2F2F2"/>
+            <w:tcBorders>
+              <w:top w:val="single" w:sz="4" w:space="0" w:color="000000"/>
+              <w:left w:val="single" w:sz="4" w:space="0" w:color="000000"/>
+              <w:bottom w:val="single" w:sz="4" w:space="0" w:color="000000"/>
+              <w:right w:val="single" w:sz="4" w:space="0" w:color="000000"/>
+            </w:tcBorders>
+          </w:tcPr>
+          <w:p>
+            <w:pPr>
+              <w:spacing w:before="80" w:after="80"/>
+              <w:jc w:val="left"/>
+            </w:pPr>
+            <w:r>
+              <w:rPr>
+                <w:b w:val="0"/>
+                <w:i w:val="0"/>
+                <w:color w:val="000000"/>
+                <w:sz w:val="19"/>
+              </w:rPr>
+              <w:t>SHARP EV cars can send real-time data (battery level, fault codes, warnings) to the cloud.</w:t>
             </w:r>
           </w:p>
         </w:tc>
@@ -461,59 +436,25 @@
           <w:tcPr>
             <w:tcW w:type="dxa" w:w="2381"/>
             <w:vAlign w:val="center"/>
-            <w:shd w:val="clear" w:color="auto" w:fill="FFEBEE"/>
+            <w:shd w:val="clear" w:color="auto" w:fill="F2F2F2"/>
             <w:tcBorders>
-              <w:top w:val="single" w:sz="2" w:space="0" w:color="DDDDDD"/>
-              <w:left w:val="single" w:sz="2" w:space="0" w:color="DDDDDD"/>
-              <w:bottom w:val="single" w:sz="2" w:space="0" w:color="DDDDDD"/>
-              <w:right w:val="single" w:sz="2" w:space="0" w:color="DDDDDD"/>
+              <w:top w:val="single" w:sz="4" w:space="0" w:color="000000"/>
+              <w:left w:val="single" w:sz="4" w:space="0" w:color="000000"/>
+              <w:bottom w:val="single" w:sz="4" w:space="0" w:color="000000"/>
+              <w:right w:val="single" w:sz="4" w:space="0" w:color="000000"/>
             </w:tcBorders>
           </w:tcPr>
           <w:p>
             <w:pPr>
-              <w:spacing w:before="60" w:after="60"/>
+              <w:spacing w:before="80" w:after="80"/>
               <w:jc w:val="left"/>
             </w:pPr>
             <w:r>
               <w:rPr>
                 <w:b w:val="0"/>
                 <w:i w:val="0"/>
-                <w:color w:val="1A1A1A"/>
-                <w:sz w:val="18"/>
-              </w:rPr>
-              <w:t>SHARP EV cars can send real-time data (battery, fault codes, warnings) to the cloud.</w:t>
-            </w:r>
-          </w:p>
-        </w:tc>
-        <w:tc>
-          <w:tcPr>
-            <w:tcW w:type="dxa" w:w="2381"/>
-            <w:vAlign w:val="center"/>
-            <w:shd w:val="clear" w:color="auto" w:fill="FFF8F8"/>
-            <w:tcBorders>
-              <w:top w:val="single" w:sz="2" w:space="0" w:color="DDDDDD"/>
-              <w:left w:val="single" w:sz="2" w:space="0" w:color="DDDDDD"/>
-              <w:bottom w:val="single" w:sz="2" w:space="0" w:color="DDDDDD"/>
-              <w:right w:val="single" w:sz="2" w:space="0" w:color="DDDDDD"/>
-            </w:tcBorders>
-          </w:tcPr>
-          <w:p>
-            <w:pPr>
-              <w:spacing w:before="60" w:after="60"/>
-              <w:jc w:val="left"/>
-            </w:pPr>
-            <w:r>
-              <w:rPr>
-                <w:b/>
-                <w:color w:val="C62828"/>
-                <w:sz w:val="18"/>
-              </w:rPr>
-              <w:t xml:space="preserve">⚠  </w:t>
-            </w:r>
-            <w:r>
-              <w:rPr>
-                <w:color w:val="1A1A1A"/>
-                <w:sz w:val="18"/>
+                <w:color w:val="000000"/>
+                <w:sz w:val="19"/>
               </w:rPr>
               <w:t>Self-Diagnosis feature cannot be built. Feature will be removed from Version 1 and pushed to a later release.</w:t>
             </w:r>
@@ -521,33 +462,27 @@
         </w:tc>
         <w:tc>
           <w:tcPr>
-            <w:tcW w:type="dxa" w:w="2381"/>
+            <w:tcW w:type="dxa" w:w="2324"/>
             <w:vAlign w:val="center"/>
-            <w:shd w:val="clear" w:color="auto" w:fill="F6FFF6"/>
+            <w:shd w:val="clear" w:color="auto" w:fill="F2F2F2"/>
             <w:tcBorders>
-              <w:top w:val="single" w:sz="2" w:space="0" w:color="DDDDDD"/>
-              <w:left w:val="single" w:sz="2" w:space="0" w:color="DDDDDD"/>
-              <w:bottom w:val="single" w:sz="2" w:space="0" w:color="DDDDDD"/>
-              <w:right w:val="single" w:sz="2" w:space="0" w:color="DDDDDD"/>
+              <w:top w:val="single" w:sz="4" w:space="0" w:color="000000"/>
+              <w:left w:val="single" w:sz="4" w:space="0" w:color="000000"/>
+              <w:bottom w:val="single" w:sz="4" w:space="0" w:color="000000"/>
+              <w:right w:val="single" w:sz="4" w:space="0" w:color="000000"/>
             </w:tcBorders>
           </w:tcPr>
           <w:p>
             <w:pPr>
-              <w:spacing w:before="60" w:after="60"/>
+              <w:spacing w:before="80" w:after="80"/>
               <w:jc w:val="left"/>
             </w:pPr>
             <w:r>
               <w:rPr>
-                <w:b/>
-                <w:color w:val="2E7D32"/>
-                <w:sz w:val="18"/>
-              </w:rPr>
-              <w:t xml:space="preserve">✔  </w:t>
-            </w:r>
-            <w:r>
-              <w:rPr>
-                <w:color w:val="1A1A1A"/>
-                <w:sz w:val="18"/>
+                <w:b w:val="0"/>
+                <w:i w:val="0"/>
+                <w:color w:val="000000"/>
+                <w:sz w:val="19"/>
               </w:rPr>
               <w:t>Confirm if vehicle data connection exists. If not available, Self-Diagnosis will be image-only in Version 1.</w:t>
             </w:r>
@@ -555,30 +490,29 @@
         </w:tc>
       </w:tr>
       <w:tr>
-        <w:trPr/>
         <w:tc>
           <w:tcPr>
-            <w:tcW w:type="dxa" w:w="454"/>
+            <w:tcW w:type="dxa" w:w="397"/>
             <w:vAlign w:val="center"/>
-            <w:shd w:val="clear" w:color="auto" w:fill="6A1B9A"/>
+            <w:shd w:val="clear" w:color="auto" w:fill="FFFFFF"/>
             <w:tcBorders>
-              <w:top w:val="single" w:sz="6" w:space="0" w:color="6A1B9A"/>
-              <w:left w:val="single" w:sz="6" w:space="0" w:color="6A1B9A"/>
-              <w:bottom w:val="single" w:sz="6" w:space="0" w:color="6A1B9A"/>
-              <w:right w:val="single" w:sz="6" w:space="0" w:color="6A1B9A"/>
+              <w:top w:val="single" w:sz="4" w:space="0" w:color="000000"/>
+              <w:left w:val="single" w:sz="4" w:space="0" w:color="000000"/>
+              <w:bottom w:val="single" w:sz="4" w:space="0" w:color="000000"/>
+              <w:right w:val="single" w:sz="4" w:space="0" w:color="000000"/>
             </w:tcBorders>
           </w:tcPr>
           <w:p>
             <w:pPr>
-              <w:spacing w:before="60" w:after="60"/>
+              <w:spacing w:before="80" w:after="80"/>
               <w:jc w:val="center"/>
             </w:pPr>
             <w:r>
               <w:rPr>
                 <w:b/>
                 <w:i w:val="0"/>
-                <w:color w:val="FFFFFF"/>
-                <w:sz w:val="28"/>
+                <w:color w:val="000000"/>
+                <w:sz w:val="22"/>
               </w:rPr>
               <w:t>3</w:t>
             </w:r>
@@ -586,57 +520,55 @@
         </w:tc>
         <w:tc>
           <w:tcPr>
-            <w:tcW w:type="dxa" w:w="1587"/>
+            <w:tcW w:type="dxa" w:w="1814"/>
             <w:vAlign w:val="center"/>
-            <w:shd w:val="clear" w:color="auto" w:fill="6A1B9A"/>
+            <w:shd w:val="clear" w:color="auto" w:fill="FFFFFF"/>
             <w:tcBorders>
-              <w:top w:val="single" w:sz="4" w:space="0" w:color="6A1B9A"/>
-              <w:left w:val="single" w:sz="4" w:space="0" w:color="6A1B9A"/>
-              <w:bottom w:val="single" w:sz="4" w:space="0" w:color="6A1B9A"/>
-              <w:right w:val="single" w:sz="4" w:space="0" w:color="6A1B9A"/>
+              <w:top w:val="single" w:sz="4" w:space="0" w:color="000000"/>
+              <w:left w:val="single" w:sz="4" w:space="0" w:color="000000"/>
+              <w:bottom w:val="single" w:sz="4" w:space="0" w:color="000000"/>
+              <w:right w:val="single" w:sz="4" w:space="0" w:color="000000"/>
             </w:tcBorders>
           </w:tcPr>
           <w:p>
             <w:pPr>
-              <w:spacing w:before="60" w:after="60"/>
-              <w:jc w:val="center"/>
+              <w:spacing w:before="80" w:after="80"/>
+              <w:jc w:val="left"/>
             </w:pPr>
             <w:r>
               <w:rPr>
                 <w:b/>
                 <w:i w:val="0"/>
-                <w:color w:val="FFFFFF"/>
+                <w:color w:val="000000"/>
                 <w:sz w:val="19"/>
               </w:rPr>
-              <w:t>🤖  AI Service</w:t>
-              <w:br/>
-              <w:t>Approval</w:t>
+              <w:t>AI Service Approval</w:t>
             </w:r>
           </w:p>
         </w:tc>
         <w:tc>
           <w:tcPr>
-            <w:tcW w:type="dxa" w:w="2381"/>
+            <w:tcW w:type="dxa" w:w="2268"/>
             <w:vAlign w:val="center"/>
-            <w:shd w:val="clear" w:color="auto" w:fill="EDE7F6"/>
+            <w:shd w:val="clear" w:color="auto" w:fill="FFFFFF"/>
             <w:tcBorders>
-              <w:top w:val="single" w:sz="2" w:space="0" w:color="DDDDDD"/>
-              <w:left w:val="single" w:sz="2" w:space="0" w:color="DDDDDD"/>
-              <w:bottom w:val="single" w:sz="2" w:space="0" w:color="DDDDDD"/>
-              <w:right w:val="single" w:sz="2" w:space="0" w:color="DDDDDD"/>
+              <w:top w:val="single" w:sz="4" w:space="0" w:color="000000"/>
+              <w:left w:val="single" w:sz="4" w:space="0" w:color="000000"/>
+              <w:bottom w:val="single" w:sz="4" w:space="0" w:color="000000"/>
+              <w:right w:val="single" w:sz="4" w:space="0" w:color="000000"/>
             </w:tcBorders>
           </w:tcPr>
           <w:p>
             <w:pPr>
-              <w:spacing w:before="60" w:after="60"/>
+              <w:spacing w:before="80" w:after="80"/>
               <w:jc w:val="left"/>
             </w:pPr>
             <w:r>
               <w:rPr>
                 <w:b w:val="0"/>
                 <w:i w:val="0"/>
-                <w:color w:val="1A1A1A"/>
-                <w:sz w:val="18"/>
+                <w:color w:val="000000"/>
+                <w:sz w:val="19"/>
               </w:rPr>
               <w:t>Amazon AI services (Claude AI, Titan Embeddings) are approved and active on AWS Japan before development starts.</w:t>
             </w:r>
@@ -646,33 +578,141 @@
           <w:tcPr>
             <w:tcW w:type="dxa" w:w="2381"/>
             <w:vAlign w:val="center"/>
-            <w:shd w:val="clear" w:color="auto" w:fill="FFF8F8"/>
+            <w:shd w:val="clear" w:color="auto" w:fill="FFFFFF"/>
             <w:tcBorders>
-              <w:top w:val="single" w:sz="2" w:space="0" w:color="DDDDDD"/>
-              <w:left w:val="single" w:sz="2" w:space="0" w:color="DDDDDD"/>
-              <w:bottom w:val="single" w:sz="2" w:space="0" w:color="DDDDDD"/>
-              <w:right w:val="single" w:sz="2" w:space="0" w:color="DDDDDD"/>
+              <w:top w:val="single" w:sz="4" w:space="0" w:color="000000"/>
+              <w:left w:val="single" w:sz="4" w:space="0" w:color="000000"/>
+              <w:bottom w:val="single" w:sz="4" w:space="0" w:color="000000"/>
+              <w:right w:val="single" w:sz="4" w:space="0" w:color="000000"/>
             </w:tcBorders>
           </w:tcPr>
           <w:p>
             <w:pPr>
-              <w:spacing w:before="60" w:after="60"/>
+              <w:spacing w:before="80" w:after="80"/>
+              <w:jc w:val="left"/>
+            </w:pPr>
+            <w:r>
+              <w:rPr>
+                <w:b w:val="0"/>
+                <w:i w:val="0"/>
+                <w:color w:val="000000"/>
+                <w:sz w:val="19"/>
+              </w:rPr>
+              <w:t>All 4 chatbot features are blocked at the same time. No backup option is available in the current design.</w:t>
+            </w:r>
+          </w:p>
+        </w:tc>
+        <w:tc>
+          <w:tcPr>
+            <w:tcW w:type="dxa" w:w="2324"/>
+            <w:vAlign w:val="center"/>
+            <w:shd w:val="clear" w:color="auto" w:fill="FFFFFF"/>
+            <w:tcBorders>
+              <w:top w:val="single" w:sz="4" w:space="0" w:color="000000"/>
+              <w:left w:val="single" w:sz="4" w:space="0" w:color="000000"/>
+              <w:bottom w:val="single" w:sz="4" w:space="0" w:color="000000"/>
+              <w:right w:val="single" w:sz="4" w:space="0" w:color="000000"/>
+            </w:tcBorders>
+          </w:tcPr>
+          <w:p>
+            <w:pPr>
+              <w:spacing w:before="80" w:after="80"/>
+              <w:jc w:val="left"/>
+            </w:pPr>
+            <w:r>
+              <w:rPr>
+                <w:b w:val="0"/>
+                <w:i w:val="0"/>
+                <w:color w:val="000000"/>
+                <w:sz w:val="19"/>
+              </w:rPr>
+              <w:t>Submit AI service approval request at project start. Confirm activation before development begins.</w:t>
+            </w:r>
+          </w:p>
+        </w:tc>
+      </w:tr>
+      <w:tr>
+        <w:tc>
+          <w:tcPr>
+            <w:tcW w:type="dxa" w:w="397"/>
+            <w:vAlign w:val="center"/>
+            <w:shd w:val="clear" w:color="auto" w:fill="F2F2F2"/>
+            <w:tcBorders>
+              <w:top w:val="single" w:sz="4" w:space="0" w:color="000000"/>
+              <w:left w:val="single" w:sz="4" w:space="0" w:color="000000"/>
+              <w:bottom w:val="single" w:sz="4" w:space="0" w:color="000000"/>
+              <w:right w:val="single" w:sz="4" w:space="0" w:color="000000"/>
+            </w:tcBorders>
+          </w:tcPr>
+          <w:p>
+            <w:pPr>
+              <w:spacing w:before="80" w:after="80"/>
+              <w:jc w:val="center"/>
+            </w:pPr>
+            <w:r>
+              <w:rPr>
+                <w:b/>
+                <w:i w:val="0"/>
+                <w:color w:val="000000"/>
+                <w:sz w:val="22"/>
+              </w:rPr>
+              <w:t>4</w:t>
+            </w:r>
+          </w:p>
+        </w:tc>
+        <w:tc>
+          <w:tcPr>
+            <w:tcW w:type="dxa" w:w="1814"/>
+            <w:vAlign w:val="center"/>
+            <w:shd w:val="clear" w:color="auto" w:fill="F2F2F2"/>
+            <w:tcBorders>
+              <w:top w:val="single" w:sz="4" w:space="0" w:color="000000"/>
+              <w:left w:val="single" w:sz="4" w:space="0" w:color="000000"/>
+              <w:bottom w:val="single" w:sz="4" w:space="0" w:color="000000"/>
+              <w:right w:val="single" w:sz="4" w:space="0" w:color="000000"/>
+            </w:tcBorders>
+          </w:tcPr>
+          <w:p>
+            <w:pPr>
+              <w:spacing w:before="80" w:after="80"/>
               <w:jc w:val="left"/>
             </w:pPr>
             <w:r>
               <w:rPr>
                 <w:b/>
-                <w:color w:val="C62828"/>
-                <w:sz w:val="18"/>
+                <w:i w:val="0"/>
+                <w:color w:val="000000"/>
+                <w:sz w:val="19"/>
               </w:rPr>
-              <w:t xml:space="preserve">⚠  </w:t>
+              <w:t>Open RFQ Values</w:t>
             </w:r>
+          </w:p>
+        </w:tc>
+        <w:tc>
+          <w:tcPr>
+            <w:tcW w:type="dxa" w:w="2268"/>
+            <w:vAlign w:val="center"/>
+            <w:shd w:val="clear" w:color="auto" w:fill="F2F2F2"/>
+            <w:tcBorders>
+              <w:top w:val="single" w:sz="4" w:space="0" w:color="000000"/>
+              <w:left w:val="single" w:sz="4" w:space="0" w:color="000000"/>
+              <w:bottom w:val="single" w:sz="4" w:space="0" w:color="000000"/>
+              <w:right w:val="single" w:sz="4" w:space="0" w:color="000000"/>
+            </w:tcBorders>
+          </w:tcPr>
+          <w:p>
+            <w:pPr>
+              <w:spacing w:before="80" w:after="80"/>
+              <w:jc w:val="left"/>
+            </w:pPr>
             <w:r>
               <w:rPr>
-                <w:color w:val="1A1A1A"/>
-                <w:sz w:val="18"/>
+                <w:b w:val="0"/>
+                <w:i w:val="0"/>
+                <w:color w:val="000000"/>
+                <w:sz w:val="19"/>
               </w:rPr>
-              <w:t>All 4 chatbot features are blocked at the same time. No backup option available in current design.</w:t>
+              <w:t>SHARP confirms all unanswered values from the RFQ — response accuracy, speed, number of users, usage limits, and answer length.</w:t>
             </w:r>
           </w:p>
         </w:tc>
@@ -680,188 +720,53 @@
           <w:tcPr>
             <w:tcW w:type="dxa" w:w="2381"/>
             <w:vAlign w:val="center"/>
-            <w:shd w:val="clear" w:color="auto" w:fill="F6FFF6"/>
+            <w:shd w:val="clear" w:color="auto" w:fill="F2F2F2"/>
             <w:tcBorders>
-              <w:top w:val="single" w:sz="2" w:space="0" w:color="DDDDDD"/>
-              <w:left w:val="single" w:sz="2" w:space="0" w:color="DDDDDD"/>
-              <w:bottom w:val="single" w:sz="2" w:space="0" w:color="DDDDDD"/>
-              <w:right w:val="single" w:sz="2" w:space="0" w:color="DDDDDD"/>
+              <w:top w:val="single" w:sz="4" w:space="0" w:color="000000"/>
+              <w:left w:val="single" w:sz="4" w:space="0" w:color="000000"/>
+              <w:bottom w:val="single" w:sz="4" w:space="0" w:color="000000"/>
+              <w:right w:val="single" w:sz="4" w:space="0" w:color="000000"/>
             </w:tcBorders>
           </w:tcPr>
           <w:p>
             <w:pPr>
-              <w:spacing w:before="60" w:after="60"/>
-              <w:jc w:val="left"/>
-            </w:pPr>
-            <w:r>
-              <w:rPr>
-                <w:b/>
-                <w:color w:val="2E7D32"/>
-                <w:sz w:val="18"/>
-              </w:rPr>
-              <w:t xml:space="preserve">✔  </w:t>
-            </w:r>
-            <w:r>
-              <w:rPr>
-                <w:color w:val="1A1A1A"/>
-                <w:sz w:val="18"/>
-              </w:rPr>
-              <w:t>Submit AI service approval request at project start. Confirm activation before development begins.</w:t>
-            </w:r>
-          </w:p>
-        </w:tc>
-      </w:tr>
-      <w:tr>
-        <w:trPr/>
-        <w:tc>
-          <w:tcPr>
-            <w:tcW w:type="dxa" w:w="454"/>
-            <w:vAlign w:val="center"/>
-            <w:shd w:val="clear" w:color="auto" w:fill="E65100"/>
-            <w:tcBorders>
-              <w:top w:val="single" w:sz="6" w:space="0" w:color="E65100"/>
-              <w:left w:val="single" w:sz="6" w:space="0" w:color="E65100"/>
-              <w:bottom w:val="single" w:sz="6" w:space="0" w:color="E65100"/>
-              <w:right w:val="single" w:sz="6" w:space="0" w:color="E65100"/>
-            </w:tcBorders>
-          </w:tcPr>
-          <w:p>
-            <w:pPr>
-              <w:spacing w:before="60" w:after="60"/>
-              <w:jc w:val="center"/>
-            </w:pPr>
-            <w:r>
-              <w:rPr>
-                <w:b/>
-                <w:i w:val="0"/>
-                <w:color w:val="FFFFFF"/>
-                <w:sz w:val="28"/>
-              </w:rPr>
-              <w:t>4</w:t>
-            </w:r>
-          </w:p>
-        </w:tc>
-        <w:tc>
-          <w:tcPr>
-            <w:tcW w:type="dxa" w:w="1587"/>
-            <w:vAlign w:val="center"/>
-            <w:shd w:val="clear" w:color="auto" w:fill="E65100"/>
-            <w:tcBorders>
-              <w:top w:val="single" w:sz="4" w:space="0" w:color="E65100"/>
-              <w:left w:val="single" w:sz="4" w:space="0" w:color="E65100"/>
-              <w:bottom w:val="single" w:sz="4" w:space="0" w:color="E65100"/>
-              <w:right w:val="single" w:sz="4" w:space="0" w:color="E65100"/>
-            </w:tcBorders>
-          </w:tcPr>
-          <w:p>
-            <w:pPr>
-              <w:spacing w:before="60" w:after="60"/>
-              <w:jc w:val="center"/>
-            </w:pPr>
-            <w:r>
-              <w:rPr>
-                <w:b/>
-                <w:i w:val="0"/>
-                <w:color w:val="FFFFFF"/>
-                <w:sz w:val="19"/>
-              </w:rPr>
-              <w:t>📋  Open RFQ</w:t>
-              <w:br/>
-              <w:t>Values</w:t>
-            </w:r>
-          </w:p>
-        </w:tc>
-        <w:tc>
-          <w:tcPr>
-            <w:tcW w:type="dxa" w:w="2381"/>
-            <w:vAlign w:val="center"/>
-            <w:shd w:val="clear" w:color="auto" w:fill="FFF3E0"/>
-            <w:tcBorders>
-              <w:top w:val="single" w:sz="2" w:space="0" w:color="DDDDDD"/>
-              <w:left w:val="single" w:sz="2" w:space="0" w:color="DDDDDD"/>
-              <w:bottom w:val="single" w:sz="2" w:space="0" w:color="DDDDDD"/>
-              <w:right w:val="single" w:sz="2" w:space="0" w:color="DDDDDD"/>
-            </w:tcBorders>
-          </w:tcPr>
-          <w:p>
-            <w:pPr>
-              <w:spacing w:before="60" w:after="60"/>
+              <w:spacing w:before="80" w:after="80"/>
               <w:jc w:val="left"/>
             </w:pPr>
             <w:r>
               <w:rPr>
                 <w:b w:val="0"/>
                 <w:i w:val="0"/>
-                <w:color w:val="1A1A1A"/>
-                <w:sz w:val="18"/>
+                <w:color w:val="000000"/>
+                <w:sz w:val="19"/>
               </w:rPr>
-              <w:t>SHARP confirms all unanswered values from the RFQ — response accuracy, speed, number of users, usage limits, answer length.</w:t>
+              <w:t>System is built for the wrong scale. Rebuilding in the final weeks causes delays and extra cost.</w:t>
             </w:r>
           </w:p>
         </w:tc>
         <w:tc>
           <w:tcPr>
-            <w:tcW w:type="dxa" w:w="2381"/>
+            <w:tcW w:type="dxa" w:w="2324"/>
             <w:vAlign w:val="center"/>
-            <w:shd w:val="clear" w:color="auto" w:fill="FFF8F8"/>
+            <w:shd w:val="clear" w:color="auto" w:fill="F2F2F2"/>
             <w:tcBorders>
-              <w:top w:val="single" w:sz="2" w:space="0" w:color="DDDDDD"/>
-              <w:left w:val="single" w:sz="2" w:space="0" w:color="DDDDDD"/>
-              <w:bottom w:val="single" w:sz="2" w:space="0" w:color="DDDDDD"/>
-              <w:right w:val="single" w:sz="2" w:space="0" w:color="DDDDDD"/>
+              <w:top w:val="single" w:sz="4" w:space="0" w:color="000000"/>
+              <w:left w:val="single" w:sz="4" w:space="0" w:color="000000"/>
+              <w:bottom w:val="single" w:sz="4" w:space="0" w:color="000000"/>
+              <w:right w:val="single" w:sz="4" w:space="0" w:color="000000"/>
             </w:tcBorders>
           </w:tcPr>
           <w:p>
             <w:pPr>
-              <w:spacing w:before="60" w:after="60"/>
+              <w:spacing w:before="80" w:after="80"/>
               <w:jc w:val="left"/>
             </w:pPr>
             <w:r>
               <w:rPr>
-                <w:b/>
-                <w:color w:val="C62828"/>
-                <w:sz w:val="18"/>
-              </w:rPr>
-              <w:t xml:space="preserve">⚠  </w:t>
-            </w:r>
-            <w:r>
-              <w:rPr>
-                <w:color w:val="1A1A1A"/>
-                <w:sz w:val="18"/>
-              </w:rPr>
-              <w:t>System is built for the wrong scale. Rebuilding in final weeks causes delays and extra cost.</w:t>
-            </w:r>
-          </w:p>
-        </w:tc>
-        <w:tc>
-          <w:tcPr>
-            <w:tcW w:type="dxa" w:w="2381"/>
-            <w:vAlign w:val="center"/>
-            <w:shd w:val="clear" w:color="auto" w:fill="F6FFF6"/>
-            <w:tcBorders>
-              <w:top w:val="single" w:sz="2" w:space="0" w:color="DDDDDD"/>
-              <w:left w:val="single" w:sz="2" w:space="0" w:color="DDDDDD"/>
-              <w:bottom w:val="single" w:sz="2" w:space="0" w:color="DDDDDD"/>
-              <w:right w:val="single" w:sz="2" w:space="0" w:color="DDDDDD"/>
-            </w:tcBorders>
-          </w:tcPr>
-          <w:p>
-            <w:pPr>
-              <w:spacing w:before="60" w:after="60"/>
-              <w:jc w:val="left"/>
-            </w:pPr>
-            <w:r>
-              <w:rPr>
-                <w:b/>
-                <w:color w:val="2E7D32"/>
-                <w:sz w:val="18"/>
-              </w:rPr>
-              <w:t xml:space="preserve">✔  </w:t>
-            </w:r>
-            <w:r>
-              <w:rPr>
-                <w:color w:val="1A1A1A"/>
-                <w:sz w:val="18"/>
+                <w:b w:val="0"/>
+                <w:i w:val="0"/>
+                <w:color w:val="000000"/>
+                <w:sz w:val="19"/>
               </w:rPr>
               <w:t>All open values must be confirmed in writing by SHARP before development starts.</w:t>
             </w:r>
@@ -869,30 +774,29 @@
         </w:tc>
       </w:tr>
       <w:tr>
-        <w:trPr/>
         <w:tc>
           <w:tcPr>
-            <w:tcW w:type="dxa" w:w="454"/>
+            <w:tcW w:type="dxa" w:w="397"/>
             <w:vAlign w:val="center"/>
-            <w:shd w:val="clear" w:color="auto" w:fill="2E7D32"/>
+            <w:shd w:val="clear" w:color="auto" w:fill="FFFFFF"/>
             <w:tcBorders>
-              <w:top w:val="single" w:sz="6" w:space="0" w:color="2E7D32"/>
-              <w:left w:val="single" w:sz="6" w:space="0" w:color="2E7D32"/>
-              <w:bottom w:val="single" w:sz="6" w:space="0" w:color="2E7D32"/>
-              <w:right w:val="single" w:sz="6" w:space="0" w:color="2E7D32"/>
+              <w:top w:val="single" w:sz="4" w:space="0" w:color="000000"/>
+              <w:left w:val="single" w:sz="4" w:space="0" w:color="000000"/>
+              <w:bottom w:val="single" w:sz="4" w:space="0" w:color="000000"/>
+              <w:right w:val="single" w:sz="4" w:space="0" w:color="000000"/>
             </w:tcBorders>
           </w:tcPr>
           <w:p>
             <w:pPr>
-              <w:spacing w:before="60" w:after="60"/>
+              <w:spacing w:before="80" w:after="80"/>
               <w:jc w:val="center"/>
             </w:pPr>
             <w:r>
               <w:rPr>
                 <w:b/>
                 <w:i w:val="0"/>
-                <w:color w:val="FFFFFF"/>
-                <w:sz w:val="28"/>
+                <w:color w:val="000000"/>
+                <w:sz w:val="22"/>
               </w:rPr>
               <w:t>5</w:t>
             </w:r>
@@ -900,57 +804,55 @@
         </w:tc>
         <w:tc>
           <w:tcPr>
-            <w:tcW w:type="dxa" w:w="1587"/>
+            <w:tcW w:type="dxa" w:w="1814"/>
             <w:vAlign w:val="center"/>
-            <w:shd w:val="clear" w:color="auto" w:fill="2E7D32"/>
+            <w:shd w:val="clear" w:color="auto" w:fill="FFFFFF"/>
             <w:tcBorders>
-              <w:top w:val="single" w:sz="4" w:space="0" w:color="2E7D32"/>
-              <w:left w:val="single" w:sz="4" w:space="0" w:color="2E7D32"/>
-              <w:bottom w:val="single" w:sz="4" w:space="0" w:color="2E7D32"/>
-              <w:right w:val="single" w:sz="4" w:space="0" w:color="2E7D32"/>
+              <w:top w:val="single" w:sz="4" w:space="0" w:color="000000"/>
+              <w:left w:val="single" w:sz="4" w:space="0" w:color="000000"/>
+              <w:bottom w:val="single" w:sz="4" w:space="0" w:color="000000"/>
+              <w:right w:val="single" w:sz="4" w:space="0" w:color="000000"/>
             </w:tcBorders>
           </w:tcPr>
           <w:p>
             <w:pPr>
-              <w:spacing w:before="60" w:after="60"/>
-              <w:jc w:val="center"/>
+              <w:spacing w:before="80" w:after="80"/>
+              <w:jc w:val="left"/>
             </w:pPr>
             <w:r>
               <w:rPr>
                 <w:b/>
                 <w:i w:val="0"/>
-                <w:color w:val="FFFFFF"/>
+                <w:color w:val="000000"/>
                 <w:sz w:val="19"/>
               </w:rPr>
-              <w:t>🔐  COCORO Login</w:t>
-              <w:br/>
-              <w:t>System</w:t>
+              <w:t>COCORO Login System</w:t>
             </w:r>
           </w:p>
         </w:tc>
         <w:tc>
           <w:tcPr>
-            <w:tcW w:type="dxa" w:w="2381"/>
+            <w:tcW w:type="dxa" w:w="2268"/>
             <w:vAlign w:val="center"/>
-            <w:shd w:val="clear" w:color="auto" w:fill="E8F5E9"/>
+            <w:shd w:val="clear" w:color="auto" w:fill="FFFFFF"/>
             <w:tcBorders>
-              <w:top w:val="single" w:sz="2" w:space="0" w:color="DDDDDD"/>
-              <w:left w:val="single" w:sz="2" w:space="0" w:color="DDDDDD"/>
-              <w:bottom w:val="single" w:sz="2" w:space="0" w:color="DDDDDD"/>
-              <w:right w:val="single" w:sz="2" w:space="0" w:color="DDDDDD"/>
+              <w:top w:val="single" w:sz="4" w:space="0" w:color="000000"/>
+              <w:left w:val="single" w:sz="4" w:space="0" w:color="000000"/>
+              <w:bottom w:val="single" w:sz="4" w:space="0" w:color="000000"/>
+              <w:right w:val="single" w:sz="4" w:space="0" w:color="000000"/>
             </w:tcBorders>
           </w:tcPr>
           <w:p>
             <w:pPr>
-              <w:spacing w:before="60" w:after="60"/>
+              <w:spacing w:before="80" w:after="80"/>
               <w:jc w:val="left"/>
             </w:pPr>
             <w:r>
               <w:rPr>
                 <w:b w:val="0"/>
                 <w:i w:val="0"/>
-                <w:color w:val="1A1A1A"/>
-                <w:sz w:val="18"/>
+                <w:color w:val="000000"/>
+                <w:sz w:val="19"/>
               </w:rPr>
               <w:t>SHARP provides COCORO MEMBERS ID login system technical details and test access before integration begins.</w:t>
             </w:r>
@@ -960,31 +862,25 @@
           <w:tcPr>
             <w:tcW w:type="dxa" w:w="2381"/>
             <w:vAlign w:val="center"/>
-            <w:shd w:val="clear" w:color="auto" w:fill="FFF8F8"/>
+            <w:shd w:val="clear" w:color="auto" w:fill="FFFFFF"/>
             <w:tcBorders>
-              <w:top w:val="single" w:sz="2" w:space="0" w:color="DDDDDD"/>
-              <w:left w:val="single" w:sz="2" w:space="0" w:color="DDDDDD"/>
-              <w:bottom w:val="single" w:sz="2" w:space="0" w:color="DDDDDD"/>
-              <w:right w:val="single" w:sz="2" w:space="0" w:color="DDDDDD"/>
+              <w:top w:val="single" w:sz="4" w:space="0" w:color="000000"/>
+              <w:left w:val="single" w:sz="4" w:space="0" w:color="000000"/>
+              <w:bottom w:val="single" w:sz="4" w:space="0" w:color="000000"/>
+              <w:right w:val="single" w:sz="4" w:space="0" w:color="000000"/>
             </w:tcBorders>
           </w:tcPr>
           <w:p>
             <w:pPr>
-              <w:spacing w:before="60" w:after="60"/>
+              <w:spacing w:before="80" w:after="80"/>
               <w:jc w:val="left"/>
             </w:pPr>
             <w:r>
               <w:rPr>
-                <w:b/>
-                <w:color w:val="C62828"/>
-                <w:sz w:val="18"/>
-              </w:rPr>
-              <w:t xml:space="preserve">⚠  </w:t>
-            </w:r>
-            <w:r>
-              <w:rPr>
-                <w:color w:val="1A1A1A"/>
-                <w:sz w:val="18"/>
+                <w:b w:val="0"/>
+                <w:i w:val="0"/>
+                <w:color w:val="000000"/>
+                <w:sz w:val="19"/>
               </w:rPr>
               <w:t>Chatbot cannot go live without a working login. All user testing is blocked. SHARP security team will not approve go-live.</w:t>
             </w:r>
@@ -992,33 +888,27 @@
         </w:tc>
         <w:tc>
           <w:tcPr>
-            <w:tcW w:type="dxa" w:w="2381"/>
+            <w:tcW w:type="dxa" w:w="2324"/>
             <w:vAlign w:val="center"/>
-            <w:shd w:val="clear" w:color="auto" w:fill="F6FFF6"/>
+            <w:shd w:val="clear" w:color="auto" w:fill="FFFFFF"/>
             <w:tcBorders>
-              <w:top w:val="single" w:sz="2" w:space="0" w:color="DDDDDD"/>
-              <w:left w:val="single" w:sz="2" w:space="0" w:color="DDDDDD"/>
-              <w:bottom w:val="single" w:sz="2" w:space="0" w:color="DDDDDD"/>
-              <w:right w:val="single" w:sz="2" w:space="0" w:color="DDDDDD"/>
+              <w:top w:val="single" w:sz="4" w:space="0" w:color="000000"/>
+              <w:left w:val="single" w:sz="4" w:space="0" w:color="000000"/>
+              <w:bottom w:val="single" w:sz="4" w:space="0" w:color="000000"/>
+              <w:right w:val="single" w:sz="4" w:space="0" w:color="000000"/>
             </w:tcBorders>
           </w:tcPr>
           <w:p>
             <w:pPr>
-              <w:spacing w:before="60" w:after="60"/>
+              <w:spacing w:before="80" w:after="80"/>
               <w:jc w:val="left"/>
             </w:pPr>
             <w:r>
               <w:rPr>
-                <w:b/>
-                <w:color w:val="2E7D32"/>
-                <w:sz w:val="18"/>
-              </w:rPr>
-              <w:t xml:space="preserve">✔  </w:t>
-            </w:r>
-            <w:r>
-              <w:rPr>
-                <w:color w:val="1A1A1A"/>
-                <w:sz w:val="18"/>
+                <w:b w:val="0"/>
+                <w:i w:val="0"/>
+                <w:color w:val="000000"/>
+                <w:sz w:val="19"/>
               </w:rPr>
               <w:t>Share COCORO technical specification and test credentials at project start. This is a hard requirement for launch.</w:t>
             </w:r>
@@ -1032,9 +922,6 @@
         <w:pStyle w:val="Heading2"/>
       </w:pPr>
       <w:r>
-        <w:rPr>
-          <w:color w:val="1F497D"/>
-        </w:rPr>
         <w:t>Action Required from SHARP</w:t>
       </w:r>
     </w:p>
@@ -1053,27 +940,27 @@
       <w:tr>
         <w:tc>
           <w:tcPr>
-            <w:tcW w:type="dxa" w:w="454"/>
-            <w:shd w:val="clear" w:color="auto" w:fill="2E4057"/>
+            <w:tcW w:type="dxa" w:w="397"/>
+            <w:shd w:val="clear" w:color="auto" w:fill="D9D9D9"/>
             <w:tcBorders>
-              <w:top w:val="single" w:sz="6" w:space="0" w:color="2E4057"/>
-              <w:left w:val="single" w:sz="6" w:space="0" w:color="2E4057"/>
-              <w:bottom w:val="single" w:sz="6" w:space="0" w:color="2E4057"/>
-              <w:right w:val="single" w:sz="6" w:space="0" w:color="2E4057"/>
+              <w:top w:val="single" w:sz="6" w:space="0" w:color="000000"/>
+              <w:left w:val="single" w:sz="6" w:space="0" w:color="000000"/>
+              <w:bottom w:val="single" w:sz="6" w:space="0" w:color="000000"/>
+              <w:right w:val="single" w:sz="6" w:space="0" w:color="000000"/>
             </w:tcBorders>
             <w:vAlign w:val="center"/>
           </w:tcPr>
           <w:p>
             <w:pPr>
-              <w:spacing w:before="60" w:after="60"/>
+              <w:spacing w:before="80" w:after="80"/>
               <w:jc w:val="center"/>
             </w:pPr>
             <w:r>
               <w:rPr>
                 <w:b/>
                 <w:i w:val="0"/>
-                <w:color w:val="FFFFFF"/>
-                <w:sz w:val="19"/>
+                <w:color w:val="000000"/>
+                <w:sz w:val="20"/>
               </w:rPr>
               <w:t>#</w:t>
             </w:r>
@@ -1081,27 +968,27 @@
         </w:tc>
         <w:tc>
           <w:tcPr>
-            <w:tcW w:type="dxa" w:w="2268"/>
-            <w:shd w:val="clear" w:color="auto" w:fill="2E4057"/>
+            <w:tcW w:type="dxa" w:w="1984"/>
+            <w:shd w:val="clear" w:color="auto" w:fill="D9D9D9"/>
             <w:tcBorders>
-              <w:top w:val="single" w:sz="6" w:space="0" w:color="2E4057"/>
-              <w:left w:val="single" w:sz="6" w:space="0" w:color="2E4057"/>
-              <w:bottom w:val="single" w:sz="6" w:space="0" w:color="2E4057"/>
-              <w:right w:val="single" w:sz="6" w:space="0" w:color="2E4057"/>
+              <w:top w:val="single" w:sz="6" w:space="0" w:color="000000"/>
+              <w:left w:val="single" w:sz="6" w:space="0" w:color="000000"/>
+              <w:bottom w:val="single" w:sz="6" w:space="0" w:color="000000"/>
+              <w:right w:val="single" w:sz="6" w:space="0" w:color="000000"/>
             </w:tcBorders>
             <w:vAlign w:val="center"/>
           </w:tcPr>
           <w:p>
             <w:pPr>
-              <w:spacing w:before="60" w:after="60"/>
+              <w:spacing w:before="80" w:after="80"/>
               <w:jc w:val="center"/>
             </w:pPr>
             <w:r>
               <w:rPr>
                 <w:b/>
                 <w:i w:val="0"/>
-                <w:color w:val="FFFFFF"/>
-                <w:sz w:val="19"/>
+                <w:color w:val="000000"/>
+                <w:sz w:val="20"/>
               </w:rPr>
               <w:t>Item</w:t>
             </w:r>
@@ -1109,27 +996,27 @@
         </w:tc>
         <w:tc>
           <w:tcPr>
-            <w:tcW w:type="dxa" w:w="6463"/>
-            <w:shd w:val="clear" w:color="auto" w:fill="2E4057"/>
+            <w:tcW w:type="dxa" w:w="6803"/>
+            <w:shd w:val="clear" w:color="auto" w:fill="D9D9D9"/>
             <w:tcBorders>
-              <w:top w:val="single" w:sz="6" w:space="0" w:color="2E4057"/>
-              <w:left w:val="single" w:sz="6" w:space="0" w:color="2E4057"/>
-              <w:bottom w:val="single" w:sz="6" w:space="0" w:color="2E4057"/>
-              <w:right w:val="single" w:sz="6" w:space="0" w:color="2E4057"/>
+              <w:top w:val="single" w:sz="6" w:space="0" w:color="000000"/>
+              <w:left w:val="single" w:sz="6" w:space="0" w:color="000000"/>
+              <w:bottom w:val="single" w:sz="6" w:space="0" w:color="000000"/>
+              <w:right w:val="single" w:sz="6" w:space="0" w:color="000000"/>
             </w:tcBorders>
             <w:vAlign w:val="center"/>
           </w:tcPr>
           <w:p>
             <w:pPr>
-              <w:spacing w:before="60" w:after="60"/>
+              <w:spacing w:before="80" w:after="80"/>
               <w:jc w:val="center"/>
             </w:pPr>
             <w:r>
               <w:rPr>
                 <w:b/>
                 <w:i w:val="0"/>
-                <w:color w:val="FFFFFF"/>
-                <w:sz w:val="19"/>
+                <w:color w:val="000000"/>
+                <w:sz w:val="20"/>
               </w:rPr>
               <w:t>Action Required</w:t>
             </w:r>
@@ -1139,27 +1026,27 @@
       <w:tr>
         <w:tc>
           <w:tcPr>
-            <w:tcW w:type="dxa" w:w="454"/>
+            <w:tcW w:type="dxa" w:w="397"/>
             <w:vAlign w:val="center"/>
-            <w:shd w:val="clear" w:color="auto" w:fill="1565C0"/>
+            <w:shd w:val="clear" w:color="auto" w:fill="FFFFFF"/>
             <w:tcBorders>
-              <w:top w:val="single" w:sz="4" w:space="0" w:color="1565C0"/>
-              <w:left w:val="single" w:sz="4" w:space="0" w:color="1565C0"/>
-              <w:bottom w:val="single" w:sz="4" w:space="0" w:color="1565C0"/>
-              <w:right w:val="single" w:sz="4" w:space="0" w:color="1565C0"/>
+              <w:top w:val="single" w:sz="4" w:space="0" w:color="000000"/>
+              <w:left w:val="single" w:sz="4" w:space="0" w:color="000000"/>
+              <w:bottom w:val="single" w:sz="4" w:space="0" w:color="000000"/>
+              <w:right w:val="single" w:sz="4" w:space="0" w:color="000000"/>
             </w:tcBorders>
           </w:tcPr>
           <w:p>
             <w:pPr>
-              <w:spacing w:before="60" w:after="60"/>
+              <w:spacing w:before="80" w:after="80"/>
               <w:jc w:val="center"/>
             </w:pPr>
             <w:r>
               <w:rPr>
                 <w:b/>
                 <w:i w:val="0"/>
-                <w:color w:val="FFFFFF"/>
-                <w:sz w:val="22"/>
+                <w:color w:val="000000"/>
+                <w:sz w:val="19"/>
               </w:rPr>
               <w:t>1</w:t>
             </w:r>
@@ -1167,27 +1054,27 @@
         </w:tc>
         <w:tc>
           <w:tcPr>
-            <w:tcW w:type="dxa" w:w="2268"/>
+            <w:tcW w:type="dxa" w:w="1984"/>
             <w:vAlign w:val="center"/>
-            <w:shd w:val="clear" w:color="auto" w:fill="1565C0"/>
+            <w:shd w:val="clear" w:color="auto" w:fill="FFFFFF"/>
             <w:tcBorders>
-              <w:top w:val="single" w:sz="4" w:space="0" w:color="1565C0"/>
-              <w:left w:val="single" w:sz="4" w:space="0" w:color="1565C0"/>
-              <w:bottom w:val="single" w:sz="4" w:space="0" w:color="1565C0"/>
-              <w:right w:val="single" w:sz="4" w:space="0" w:color="1565C0"/>
+              <w:top w:val="single" w:sz="4" w:space="0" w:color="000000"/>
+              <w:left w:val="single" w:sz="4" w:space="0" w:color="000000"/>
+              <w:bottom w:val="single" w:sz="4" w:space="0" w:color="000000"/>
+              <w:right w:val="single" w:sz="4" w:space="0" w:color="000000"/>
             </w:tcBorders>
           </w:tcPr>
           <w:p>
             <w:pPr>
-              <w:spacing w:before="60" w:after="60"/>
+              <w:spacing w:before="80" w:after="80"/>
               <w:jc w:val="left"/>
             </w:pPr>
             <w:r>
               <w:rPr>
                 <w:b/>
                 <w:i w:val="0"/>
-                <w:color w:val="FFFFFF"/>
-                <w:sz w:val="18"/>
+                <w:color w:val="000000"/>
+                <w:sz w:val="19"/>
               </w:rPr>
               <w:t>EV Manuals</w:t>
             </w:r>
@@ -1195,27 +1082,27 @@
         </w:tc>
         <w:tc>
           <w:tcPr>
-            <w:tcW w:type="dxa" w:w="6463"/>
+            <w:tcW w:type="dxa" w:w="6803"/>
             <w:vAlign w:val="center"/>
             <w:shd w:val="clear" w:color="auto" w:fill="FFFFFF"/>
             <w:tcBorders>
-              <w:top w:val="single" w:sz="2" w:space="0" w:color="DDDDDD"/>
-              <w:left w:val="single" w:sz="2" w:space="0" w:color="DDDDDD"/>
-              <w:bottom w:val="single" w:sz="2" w:space="0" w:color="DDDDDD"/>
-              <w:right w:val="single" w:sz="2" w:space="0" w:color="DDDDDD"/>
+              <w:top w:val="single" w:sz="4" w:space="0" w:color="000000"/>
+              <w:left w:val="single" w:sz="4" w:space="0" w:color="000000"/>
+              <w:bottom w:val="single" w:sz="4" w:space="0" w:color="000000"/>
+              <w:right w:val="single" w:sz="4" w:space="0" w:color="000000"/>
             </w:tcBorders>
           </w:tcPr>
           <w:p>
             <w:pPr>
-              <w:spacing w:before="60" w:after="60"/>
+              <w:spacing w:before="80" w:after="80"/>
               <w:jc w:val="left"/>
             </w:pPr>
             <w:r>
               <w:rPr>
                 <w:b w:val="0"/>
                 <w:i w:val="0"/>
-                <w:color w:val="1A1A1A"/>
-                <w:sz w:val="18"/>
+                <w:color w:val="000000"/>
+                <w:sz w:val="19"/>
               </w:rPr>
               <w:t>Provide digital PDF files with readable text</w:t>
             </w:r>
@@ -1225,27 +1112,27 @@
       <w:tr>
         <w:tc>
           <w:tcPr>
-            <w:tcW w:type="dxa" w:w="454"/>
+            <w:tcW w:type="dxa" w:w="397"/>
             <w:vAlign w:val="center"/>
-            <w:shd w:val="clear" w:color="auto" w:fill="C62828"/>
+            <w:shd w:val="clear" w:color="auto" w:fill="F2F2F2"/>
             <w:tcBorders>
-              <w:top w:val="single" w:sz="4" w:space="0" w:color="C62828"/>
-              <w:left w:val="single" w:sz="4" w:space="0" w:color="C62828"/>
-              <w:bottom w:val="single" w:sz="4" w:space="0" w:color="C62828"/>
-              <w:right w:val="single" w:sz="4" w:space="0" w:color="C62828"/>
+              <w:top w:val="single" w:sz="4" w:space="0" w:color="000000"/>
+              <w:left w:val="single" w:sz="4" w:space="0" w:color="000000"/>
+              <w:bottom w:val="single" w:sz="4" w:space="0" w:color="000000"/>
+              <w:right w:val="single" w:sz="4" w:space="0" w:color="000000"/>
             </w:tcBorders>
           </w:tcPr>
           <w:p>
             <w:pPr>
-              <w:spacing w:before="60" w:after="60"/>
+              <w:spacing w:before="80" w:after="80"/>
               <w:jc w:val="center"/>
             </w:pPr>
             <w:r>
               <w:rPr>
                 <w:b/>
                 <w:i w:val="0"/>
-                <w:color w:val="FFFFFF"/>
-                <w:sz w:val="22"/>
+                <w:color w:val="000000"/>
+                <w:sz w:val="19"/>
               </w:rPr>
               <w:t>2</w:t>
             </w:r>
@@ -1253,27 +1140,27 @@
         </w:tc>
         <w:tc>
           <w:tcPr>
-            <w:tcW w:type="dxa" w:w="2268"/>
+            <w:tcW w:type="dxa" w:w="1984"/>
             <w:vAlign w:val="center"/>
-            <w:shd w:val="clear" w:color="auto" w:fill="C62828"/>
+            <w:shd w:val="clear" w:color="auto" w:fill="F2F2F2"/>
             <w:tcBorders>
-              <w:top w:val="single" w:sz="4" w:space="0" w:color="C62828"/>
-              <w:left w:val="single" w:sz="4" w:space="0" w:color="C62828"/>
-              <w:bottom w:val="single" w:sz="4" w:space="0" w:color="C62828"/>
-              <w:right w:val="single" w:sz="4" w:space="0" w:color="C62828"/>
+              <w:top w:val="single" w:sz="4" w:space="0" w:color="000000"/>
+              <w:left w:val="single" w:sz="4" w:space="0" w:color="000000"/>
+              <w:bottom w:val="single" w:sz="4" w:space="0" w:color="000000"/>
+              <w:right w:val="single" w:sz="4" w:space="0" w:color="000000"/>
             </w:tcBorders>
           </w:tcPr>
           <w:p>
             <w:pPr>
-              <w:spacing w:before="60" w:after="60"/>
+              <w:spacing w:before="80" w:after="80"/>
               <w:jc w:val="left"/>
             </w:pPr>
             <w:r>
               <w:rPr>
                 <w:b/>
                 <w:i w:val="0"/>
-                <w:color w:val="FFFFFF"/>
-                <w:sz w:val="18"/>
+                <w:color w:val="000000"/>
+                <w:sz w:val="19"/>
               </w:rPr>
               <w:t>Vehicle Data</w:t>
             </w:r>
@@ -1281,29 +1168,29 @@
         </w:tc>
         <w:tc>
           <w:tcPr>
-            <w:tcW w:type="dxa" w:w="6463"/>
+            <w:tcW w:type="dxa" w:w="6803"/>
             <w:vAlign w:val="center"/>
-            <w:shd w:val="clear" w:color="auto" w:fill="F8F9FA"/>
+            <w:shd w:val="clear" w:color="auto" w:fill="F2F2F2"/>
             <w:tcBorders>
-              <w:top w:val="single" w:sz="2" w:space="0" w:color="DDDDDD"/>
-              <w:left w:val="single" w:sz="2" w:space="0" w:color="DDDDDD"/>
-              <w:bottom w:val="single" w:sz="2" w:space="0" w:color="DDDDDD"/>
-              <w:right w:val="single" w:sz="2" w:space="0" w:color="DDDDDD"/>
+              <w:top w:val="single" w:sz="4" w:space="0" w:color="000000"/>
+              <w:left w:val="single" w:sz="4" w:space="0" w:color="000000"/>
+              <w:bottom w:val="single" w:sz="4" w:space="0" w:color="000000"/>
+              <w:right w:val="single" w:sz="4" w:space="0" w:color="000000"/>
             </w:tcBorders>
           </w:tcPr>
           <w:p>
             <w:pPr>
-              <w:spacing w:before="60" w:after="60"/>
+              <w:spacing w:before="80" w:after="80"/>
               <w:jc w:val="left"/>
             </w:pPr>
             <w:r>
               <w:rPr>
                 <w:b w:val="0"/>
                 <w:i w:val="0"/>
-                <w:color w:val="1A1A1A"/>
-                <w:sz w:val="18"/>
+                <w:color w:val="000000"/>
+                <w:sz w:val="19"/>
               </w:rPr>
-              <w:t>Confirm if vehicle sensor data connection exists and share details</w:t>
+              <w:t>Confirm if vehicle sensor data connection exists and share technical details</w:t>
             </w:r>
           </w:p>
         </w:tc>
@@ -1311,27 +1198,27 @@
       <w:tr>
         <w:tc>
           <w:tcPr>
-            <w:tcW w:type="dxa" w:w="454"/>
+            <w:tcW w:type="dxa" w:w="397"/>
             <w:vAlign w:val="center"/>
-            <w:shd w:val="clear" w:color="auto" w:fill="6A1B9A"/>
+            <w:shd w:val="clear" w:color="auto" w:fill="FFFFFF"/>
             <w:tcBorders>
-              <w:top w:val="single" w:sz="4" w:space="0" w:color="6A1B9A"/>
-              <w:left w:val="single" w:sz="4" w:space="0" w:color="6A1B9A"/>
-              <w:bottom w:val="single" w:sz="4" w:space="0" w:color="6A1B9A"/>
-              <w:right w:val="single" w:sz="4" w:space="0" w:color="6A1B9A"/>
+              <w:top w:val="single" w:sz="4" w:space="0" w:color="000000"/>
+              <w:left w:val="single" w:sz="4" w:space="0" w:color="000000"/>
+              <w:bottom w:val="single" w:sz="4" w:space="0" w:color="000000"/>
+              <w:right w:val="single" w:sz="4" w:space="0" w:color="000000"/>
             </w:tcBorders>
           </w:tcPr>
           <w:p>
             <w:pPr>
-              <w:spacing w:before="60" w:after="60"/>
+              <w:spacing w:before="80" w:after="80"/>
               <w:jc w:val="center"/>
             </w:pPr>
             <w:r>
               <w:rPr>
                 <w:b/>
                 <w:i w:val="0"/>
-                <w:color w:val="FFFFFF"/>
-                <w:sz w:val="22"/>
+                <w:color w:val="000000"/>
+                <w:sz w:val="19"/>
               </w:rPr>
               <w:t>3</w:t>
             </w:r>
@@ -1339,27 +1226,27 @@
         </w:tc>
         <w:tc>
           <w:tcPr>
-            <w:tcW w:type="dxa" w:w="2268"/>
+            <w:tcW w:type="dxa" w:w="1984"/>
             <w:vAlign w:val="center"/>
-            <w:shd w:val="clear" w:color="auto" w:fill="6A1B9A"/>
+            <w:shd w:val="clear" w:color="auto" w:fill="FFFFFF"/>
             <w:tcBorders>
-              <w:top w:val="single" w:sz="4" w:space="0" w:color="6A1B9A"/>
-              <w:left w:val="single" w:sz="4" w:space="0" w:color="6A1B9A"/>
-              <w:bottom w:val="single" w:sz="4" w:space="0" w:color="6A1B9A"/>
-              <w:right w:val="single" w:sz="4" w:space="0" w:color="6A1B9A"/>
+              <w:top w:val="single" w:sz="4" w:space="0" w:color="000000"/>
+              <w:left w:val="single" w:sz="4" w:space="0" w:color="000000"/>
+              <w:bottom w:val="single" w:sz="4" w:space="0" w:color="000000"/>
+              <w:right w:val="single" w:sz="4" w:space="0" w:color="000000"/>
             </w:tcBorders>
           </w:tcPr>
           <w:p>
             <w:pPr>
-              <w:spacing w:before="60" w:after="60"/>
+              <w:spacing w:before="80" w:after="80"/>
               <w:jc w:val="left"/>
             </w:pPr>
             <w:r>
               <w:rPr>
                 <w:b/>
                 <w:i w:val="0"/>
-                <w:color w:val="FFFFFF"/>
-                <w:sz w:val="18"/>
+                <w:color w:val="000000"/>
+                <w:sz w:val="19"/>
               </w:rPr>
               <w:t>AI Service Approval</w:t>
             </w:r>
@@ -1367,27 +1254,27 @@
         </w:tc>
         <w:tc>
           <w:tcPr>
-            <w:tcW w:type="dxa" w:w="6463"/>
+            <w:tcW w:type="dxa" w:w="6803"/>
             <w:vAlign w:val="center"/>
             <w:shd w:val="clear" w:color="auto" w:fill="FFFFFF"/>
             <w:tcBorders>
-              <w:top w:val="single" w:sz="2" w:space="0" w:color="DDDDDD"/>
-              <w:left w:val="single" w:sz="2" w:space="0" w:color="DDDDDD"/>
-              <w:bottom w:val="single" w:sz="2" w:space="0" w:color="DDDDDD"/>
-              <w:right w:val="single" w:sz="2" w:space="0" w:color="DDDDDD"/>
+              <w:top w:val="single" w:sz="4" w:space="0" w:color="000000"/>
+              <w:left w:val="single" w:sz="4" w:space="0" w:color="000000"/>
+              <w:bottom w:val="single" w:sz="4" w:space="0" w:color="000000"/>
+              <w:right w:val="single" w:sz="4" w:space="0" w:color="000000"/>
             </w:tcBorders>
           </w:tcPr>
           <w:p>
             <w:pPr>
-              <w:spacing w:before="60" w:after="60"/>
+              <w:spacing w:before="80" w:after="80"/>
               <w:jc w:val="left"/>
             </w:pPr>
             <w:r>
               <w:rPr>
                 <w:b w:val="0"/>
                 <w:i w:val="0"/>
-                <w:color w:val="1A1A1A"/>
-                <w:sz w:val="18"/>
+                <w:color w:val="000000"/>
+                <w:sz w:val="19"/>
               </w:rPr>
               <w:t>Submit and confirm AWS Japan AI service activation</w:t>
             </w:r>
@@ -1397,27 +1284,27 @@
       <w:tr>
         <w:tc>
           <w:tcPr>
-            <w:tcW w:type="dxa" w:w="454"/>
+            <w:tcW w:type="dxa" w:w="397"/>
             <w:vAlign w:val="center"/>
-            <w:shd w:val="clear" w:color="auto" w:fill="E65100"/>
+            <w:shd w:val="clear" w:color="auto" w:fill="F2F2F2"/>
             <w:tcBorders>
-              <w:top w:val="single" w:sz="4" w:space="0" w:color="E65100"/>
-              <w:left w:val="single" w:sz="4" w:space="0" w:color="E65100"/>
-              <w:bottom w:val="single" w:sz="4" w:space="0" w:color="E65100"/>
-              <w:right w:val="single" w:sz="4" w:space="0" w:color="E65100"/>
+              <w:top w:val="single" w:sz="4" w:space="0" w:color="000000"/>
+              <w:left w:val="single" w:sz="4" w:space="0" w:color="000000"/>
+              <w:bottom w:val="single" w:sz="4" w:space="0" w:color="000000"/>
+              <w:right w:val="single" w:sz="4" w:space="0" w:color="000000"/>
             </w:tcBorders>
           </w:tcPr>
           <w:p>
             <w:pPr>
-              <w:spacing w:before="60" w:after="60"/>
+              <w:spacing w:before="80" w:after="80"/>
               <w:jc w:val="center"/>
             </w:pPr>
             <w:r>
               <w:rPr>
                 <w:b/>
                 <w:i w:val="0"/>
-                <w:color w:val="FFFFFF"/>
-                <w:sz w:val="22"/>
+                <w:color w:val="000000"/>
+                <w:sz w:val="19"/>
               </w:rPr>
               <w:t>4</w:t>
             </w:r>
@@ -1425,27 +1312,27 @@
         </w:tc>
         <w:tc>
           <w:tcPr>
-            <w:tcW w:type="dxa" w:w="2268"/>
+            <w:tcW w:type="dxa" w:w="1984"/>
             <w:vAlign w:val="center"/>
-            <w:shd w:val="clear" w:color="auto" w:fill="E65100"/>
+            <w:shd w:val="clear" w:color="auto" w:fill="F2F2F2"/>
             <w:tcBorders>
-              <w:top w:val="single" w:sz="4" w:space="0" w:color="E65100"/>
-              <w:left w:val="single" w:sz="4" w:space="0" w:color="E65100"/>
-              <w:bottom w:val="single" w:sz="4" w:space="0" w:color="E65100"/>
-              <w:right w:val="single" w:sz="4" w:space="0" w:color="E65100"/>
+              <w:top w:val="single" w:sz="4" w:space="0" w:color="000000"/>
+              <w:left w:val="single" w:sz="4" w:space="0" w:color="000000"/>
+              <w:bottom w:val="single" w:sz="4" w:space="0" w:color="000000"/>
+              <w:right w:val="single" w:sz="4" w:space="0" w:color="000000"/>
             </w:tcBorders>
           </w:tcPr>
           <w:p>
             <w:pPr>
-              <w:spacing w:before="60" w:after="60"/>
+              <w:spacing w:before="80" w:after="80"/>
               <w:jc w:val="left"/>
             </w:pPr>
             <w:r>
               <w:rPr>
                 <w:b/>
                 <w:i w:val="0"/>
-                <w:color w:val="FFFFFF"/>
-                <w:sz w:val="18"/>
+                <w:color w:val="000000"/>
+                <w:sz w:val="19"/>
               </w:rPr>
               <w:t>Open RFQ Values</w:t>
             </w:r>
@@ -1453,29 +1340,29 @@
         </w:tc>
         <w:tc>
           <w:tcPr>
-            <w:tcW w:type="dxa" w:w="6463"/>
+            <w:tcW w:type="dxa" w:w="6803"/>
             <w:vAlign w:val="center"/>
-            <w:shd w:val="clear" w:color="auto" w:fill="F8F9FA"/>
+            <w:shd w:val="clear" w:color="auto" w:fill="F2F2F2"/>
             <w:tcBorders>
-              <w:top w:val="single" w:sz="2" w:space="0" w:color="DDDDDD"/>
-              <w:left w:val="single" w:sz="2" w:space="0" w:color="DDDDDD"/>
-              <w:bottom w:val="single" w:sz="2" w:space="0" w:color="DDDDDD"/>
-              <w:right w:val="single" w:sz="2" w:space="0" w:color="DDDDDD"/>
+              <w:top w:val="single" w:sz="4" w:space="0" w:color="000000"/>
+              <w:left w:val="single" w:sz="4" w:space="0" w:color="000000"/>
+              <w:bottom w:val="single" w:sz="4" w:space="0" w:color="000000"/>
+              <w:right w:val="single" w:sz="4" w:space="0" w:color="000000"/>
             </w:tcBorders>
           </w:tcPr>
           <w:p>
             <w:pPr>
-              <w:spacing w:before="60" w:after="60"/>
+              <w:spacing w:before="80" w:after="80"/>
               <w:jc w:val="left"/>
             </w:pPr>
             <w:r>
               <w:rPr>
                 <w:b w:val="0"/>
                 <w:i w:val="0"/>
-                <w:color w:val="1A1A1A"/>
-                <w:sz w:val="18"/>
+                <w:color w:val="000000"/>
+                <w:sz w:val="19"/>
               </w:rPr>
-              <w:t>Provide written confirmation of all unanswered items</w:t>
+              <w:t>Provide written confirmation of all unanswered requirement items</w:t>
             </w:r>
           </w:p>
         </w:tc>
@@ -1483,27 +1370,27 @@
       <w:tr>
         <w:tc>
           <w:tcPr>
-            <w:tcW w:type="dxa" w:w="454"/>
+            <w:tcW w:type="dxa" w:w="397"/>
             <w:vAlign w:val="center"/>
-            <w:shd w:val="clear" w:color="auto" w:fill="2E7D32"/>
+            <w:shd w:val="clear" w:color="auto" w:fill="FFFFFF"/>
             <w:tcBorders>
-              <w:top w:val="single" w:sz="4" w:space="0" w:color="2E7D32"/>
-              <w:left w:val="single" w:sz="4" w:space="0" w:color="2E7D32"/>
-              <w:bottom w:val="single" w:sz="4" w:space="0" w:color="2E7D32"/>
-              <w:right w:val="single" w:sz="4" w:space="0" w:color="2E7D32"/>
+              <w:top w:val="single" w:sz="4" w:space="0" w:color="000000"/>
+              <w:left w:val="single" w:sz="4" w:space="0" w:color="000000"/>
+              <w:bottom w:val="single" w:sz="4" w:space="0" w:color="000000"/>
+              <w:right w:val="single" w:sz="4" w:space="0" w:color="000000"/>
             </w:tcBorders>
           </w:tcPr>
           <w:p>
             <w:pPr>
-              <w:spacing w:before="60" w:after="60"/>
+              <w:spacing w:before="80" w:after="80"/>
               <w:jc w:val="center"/>
             </w:pPr>
             <w:r>
               <w:rPr>
                 <w:b/>
                 <w:i w:val="0"/>
-                <w:color w:val="FFFFFF"/>
-                <w:sz w:val="22"/>
+                <w:color w:val="000000"/>
+                <w:sz w:val="19"/>
               </w:rPr>
               <w:t>5</w:t>
             </w:r>
@@ -1511,27 +1398,27 @@
         </w:tc>
         <w:tc>
           <w:tcPr>
-            <w:tcW w:type="dxa" w:w="2268"/>
+            <w:tcW w:type="dxa" w:w="1984"/>
             <w:vAlign w:val="center"/>
-            <w:shd w:val="clear" w:color="auto" w:fill="2E7D32"/>
+            <w:shd w:val="clear" w:color="auto" w:fill="FFFFFF"/>
             <w:tcBorders>
-              <w:top w:val="single" w:sz="4" w:space="0" w:color="2E7D32"/>
-              <w:left w:val="single" w:sz="4" w:space="0" w:color="2E7D32"/>
-              <w:bottom w:val="single" w:sz="4" w:space="0" w:color="2E7D32"/>
-              <w:right w:val="single" w:sz="4" w:space="0" w:color="2E7D32"/>
+              <w:top w:val="single" w:sz="4" w:space="0" w:color="000000"/>
+              <w:left w:val="single" w:sz="4" w:space="0" w:color="000000"/>
+              <w:bottom w:val="single" w:sz="4" w:space="0" w:color="000000"/>
+              <w:right w:val="single" w:sz="4" w:space="0" w:color="000000"/>
             </w:tcBorders>
           </w:tcPr>
           <w:p>
             <w:pPr>
-              <w:spacing w:before="60" w:after="60"/>
+              <w:spacing w:before="80" w:after="80"/>
               <w:jc w:val="left"/>
             </w:pPr>
             <w:r>
               <w:rPr>
                 <w:b/>
                 <w:i w:val="0"/>
-                <w:color w:val="FFFFFF"/>
-                <w:sz w:val="18"/>
+                <w:color w:val="000000"/>
+                <w:sz w:val="19"/>
               </w:rPr>
               <w:t>COCORO Login Details</w:t>
             </w:r>
@@ -1539,27 +1426,27 @@
         </w:tc>
         <w:tc>
           <w:tcPr>
-            <w:tcW w:type="dxa" w:w="6463"/>
+            <w:tcW w:type="dxa" w:w="6803"/>
             <w:vAlign w:val="center"/>
             <w:shd w:val="clear" w:color="auto" w:fill="FFFFFF"/>
             <w:tcBorders>
-              <w:top w:val="single" w:sz="2" w:space="0" w:color="DDDDDD"/>
-              <w:left w:val="single" w:sz="2" w:space="0" w:color="DDDDDD"/>
-              <w:bottom w:val="single" w:sz="2" w:space="0" w:color="DDDDDD"/>
-              <w:right w:val="single" w:sz="2" w:space="0" w:color="DDDDDD"/>
+              <w:top w:val="single" w:sz="4" w:space="0" w:color="000000"/>
+              <w:left w:val="single" w:sz="4" w:space="0" w:color="000000"/>
+              <w:bottom w:val="single" w:sz="4" w:space="0" w:color="000000"/>
+              <w:right w:val="single" w:sz="4" w:space="0" w:color="000000"/>
             </w:tcBorders>
           </w:tcPr>
           <w:p>
             <w:pPr>
-              <w:spacing w:before="60" w:after="60"/>
+              <w:spacing w:before="80" w:after="80"/>
               <w:jc w:val="left"/>
             </w:pPr>
             <w:r>
               <w:rPr>
                 <w:b w:val="0"/>
                 <w:i w:val="0"/>
-                <w:color w:val="1A1A1A"/>
-                <w:sz w:val="18"/>
+                <w:color w:val="000000"/>
+                <w:sz w:val="19"/>
               </w:rPr>
               <w:t>Share COCORO MEMBERS ID specification and test credentials</w:t>
             </w:r>
@@ -1575,7 +1462,6 @@
       <w:r>
         <w:rPr>
           <w:i/>
-          <w:color w:val="909090"/>
           <w:sz w:val="16"/>
         </w:rPr>
         <w:t>All 5 items must be confirmed before development begins  |  SHARP EV AI Chatbot  |  Confidential</w:t>

</xml_diff>